<commit_message>
Update KMS livechat addon
</commit_message>
<xml_diff>
--- a/TEAM2_KMS_report.docx
+++ b/TEAM2_KMS_report.docx
@@ -2,6 +2,20 @@
 <file path=word/document.xml><?xml version="1.0" encoding="utf-8"?>
 <w:document xmlns:wpc="http://schemas.microsoft.com/office/word/2010/wordprocessingCanvas" xmlns:cx="http://schemas.microsoft.com/office/drawing/2014/chartex" xmlns:cx1="http://schemas.microsoft.com/office/drawing/2015/9/8/chartex" xmlns:cx2="http://schemas.microsoft.com/office/drawing/2015/10/21/chartex" xmlns:cx3="http://schemas.microsoft.com/office/drawing/2016/5/9/chartex" xmlns:cx4="http://schemas.microsoft.com/office/drawing/2016/5/10/chartex" xmlns:cx5="http://schemas.microsoft.com/office/drawing/2016/5/11/chartex" xmlns:cx6="http://schemas.microsoft.com/office/drawing/2016/5/12/chartex" xmlns:cx7="http://schemas.microsoft.com/office/drawing/2016/5/13/chartex" xmlns:cx8="http://schemas.microsoft.com/office/drawing/2016/5/14/chartex" xmlns:mc="http://schemas.openxmlformats.org/markup-compatibility/2006" xmlns:aink="http://schemas.microsoft.com/office/drawing/2016/ink" xmlns:am3d="http://schemas.microsoft.com/office/drawing/2017/model3d" xmlns:o="urn:schemas-microsoft-com:office:office" xmlns:oel="http://schemas.microsoft.com/office/2019/extlst" xmlns:r="http://schemas.openxmlformats.org/officeDocument/2006/relationships" xmlns:m="http://schemas.openxmlformats.org/officeDocument/2006/math" xmlns:v="urn:schemas-microsoft-com:vml" xmlns:wp14="http://schemas.microsoft.com/office/word/2010/wordprocessingDrawing" xmlns:wp="http://schemas.openxmlformats.org/drawingml/2006/wordprocessingDrawing" xmlns:w10="urn:schemas-microsoft-com:office:word" xmlns:w="http://schemas.openxmlformats.org/wordprocessingml/2006/main" xmlns:w14="http://schemas.microsoft.com/office/word/2010/wordml" xmlns:w15="http://schemas.microsoft.com/office/word/2012/wordml" xmlns:w16cex="http://schemas.microsoft.com/office/word/2018/wordml/cex" xmlns:w16cid="http://schemas.microsoft.com/office/word/2016/wordml/cid" xmlns:w16="http://schemas.microsoft.com/office/word/2018/wordml" xmlns:w16du="http://schemas.microsoft.com/office/word/2023/wordml/word16du" xmlns:w16sdtdh="http://schemas.microsoft.com/office/word/2020/wordml/sdtdatahash" xmlns:w16sdtfl="http://schemas.microsoft.com/office/word/2024/wordml/sdtformatlock" xmlns:w16se="http://schemas.microsoft.com/office/word/2015/wordml/symex" xmlns:wpg="http://schemas.microsoft.com/office/word/2010/wordprocessingGroup" xmlns:wpi="http://schemas.microsoft.com/office/word/2010/wordprocessingInk" xmlns:wne="http://schemas.microsoft.com/office/word/2006/wordml" xmlns:wps="http://schemas.microsoft.com/office/word/2010/wordprocessingShape" mc:Ignorable="w14 w15 w16se w16cid w16 w16cex w16sdtdh w16sdtfl w16du wp14">
   <w:body>
+    <w:p>
+      <w:pPr>
+        <w:autoSpaceDE w:val="0"/>
+        <w:autoSpaceDN w:val="0"/>
+        <w:adjustRightInd w:val="0"/>
+        <w:spacing w:before="240"/>
+        <w:jc w:val="center"/>
+        <w:rPr>
+          <w:b/>
+          <w:sz w:val="32"/>
+          <w:szCs w:val="32"/>
+        </w:rPr>
+      </w:pPr>
+    </w:p>
     <w:p>
       <w:pPr>
         <w:autoSpaceDE w:val="0"/>
@@ -461,41 +475,8 @@
           <w:sz w:val="36"/>
           <w:szCs w:val="36"/>
         </w:rPr>
-        <w:t>(</w:t>
-      </w:r>
-      <w:r>
-        <w:rPr>
-          <w:b/>
-          <w:bCs/>
-          <w:sz w:val="36"/>
-          <w:szCs w:val="36"/>
-        </w:rPr>
         <w:t>TRIPLE H AND T</w:t>
       </w:r>
-      <w:r>
-        <w:rPr>
-          <w:b/>
-          <w:bCs/>
-          <w:sz w:val="36"/>
-          <w:szCs w:val="36"/>
-        </w:rPr>
-        <w:t>)</w:t>
-      </w:r>
-    </w:p>
-    <w:p>
-      <w:pPr>
-        <w:autoSpaceDE w:val="0"/>
-        <w:autoSpaceDN w:val="0"/>
-        <w:adjustRightInd w:val="0"/>
-        <w:spacing w:before="240"/>
-        <w:jc w:val="center"/>
-        <w:rPr>
-          <w:b/>
-          <w:smallCaps/>
-          <w:spacing w:val="-14"/>
-          <w:szCs w:val="26"/>
-        </w:rPr>
-      </w:pPr>
     </w:p>
     <w:p>
       <w:pPr>
@@ -745,7 +726,7 @@
           <w:color w:val="000000"/>
           <w:sz w:val="36"/>
         </w:rPr>
-        <w:t>AUTOMATION FOR (TRIPLE H AND T)</w:t>
+        <w:t>AUTOMATION FOR TRIPLE H AND T</w:t>
       </w:r>
     </w:p>
     <w:p>
@@ -1208,45 +1189,6 @@
       <w:pPr>
         <w:ind w:firstLine="720"/>
         <w:rPr>
-          <w:rStyle w:val="Emphasis"/>
-          <w:i w:val="0"/>
-          <w:iCs w:val="0"/>
-          <w:szCs w:val="26"/>
-        </w:rPr>
-      </w:pPr>
-      <w:r>
-        <w:rPr>
-          <w:rStyle w:val="Emphasis"/>
-          <w:i w:val="0"/>
-          <w:iCs w:val="0"/>
-          <w:szCs w:val="26"/>
-        </w:rPr>
-        <w:t>This report presents the Knowledge Management System (KMS) implementation for Triple H &amp; T, a simulated hardware retail and distribution company operating with approximately 60 employees in Ho Chi Minh City. The project treats Odoo not only as an ERP transaction platform but also as a corporate memory layer that captures, structures, secures, and reuses operational knowledge.</w:t>
-      </w:r>
-    </w:p>
-    <w:p>
-      <w:pPr>
-        <w:rPr>
-          <w:rStyle w:val="Emphasis"/>
-          <w:i w:val="0"/>
-          <w:iCs w:val="0"/>
-          <w:szCs w:val="26"/>
-        </w:rPr>
-      </w:pPr>
-      <w:r>
-        <w:rPr>
-          <w:rStyle w:val="Emphasis"/>
-          <w:i w:val="0"/>
-          <w:iCs w:val="0"/>
-          <w:szCs w:val="26"/>
-        </w:rPr>
-        <w:t>Across the implementation roadmap, the team converted raw master data, purchase orders, sales orders, helpdesk issues, Odoo Chatter notes, and support experiences into reusable knowledge assets. The KMS architecture includes Odoo Knowledge articles, metadata tags, a custom knowledge module, XML-RPC extraction, ChromaDB vector storage, role-aware access control, and a Week 12 Retrieval-Augmented Generation (RAG) chatbot interface.</w:t>
-      </w:r>
-    </w:p>
-    <w:p>
-      <w:pPr>
-        <w:ind w:firstLine="720"/>
-        <w:rPr>
           <w:i/>
           <w:iCs/>
           <w:szCs w:val="26"/>
@@ -1255,18 +1197,41 @@
       <w:r>
         <w:rPr>
           <w:rStyle w:val="Emphasis"/>
-          <w:i w:val="0"/>
-          <w:iCs w:val="0"/>
           <w:szCs w:val="26"/>
         </w:rPr>
+        <w:t>This report presents the Knowledge Management System (KMS) implementation for Triple H &amp; T, a simulated hardware retail and distribution company operating with approximately 60 employees in Ho Chi Minh City. The project treats Odoo not only as an ERP transaction platform but also as a corporate memory layer that captures, structures, secures, and reuses operational knowledge.</w:t>
+      </w:r>
+      <w:r>
+        <w:rPr>
+          <w:rStyle w:val="Emphasis"/>
+          <w:szCs w:val="26"/>
+        </w:rPr>
+        <w:t xml:space="preserve"> </w:t>
+      </w:r>
+      <w:r>
+        <w:rPr>
+          <w:rStyle w:val="Emphasis"/>
+          <w:szCs w:val="26"/>
+        </w:rPr>
+        <w:t>Across the implementation roadmap, the team converted raw master data, purchase orders, sales orders, helpdesk issues, Odoo Chatter notes, and support experiences into reusable knowledge assets. The KMS architecture includes Odoo Knowledge articles, metadata tags, a custom knowledge module, XML-RPC extraction, ChromaDB vector storage, role-aware access control, and a  Retrieval-Augmented Generation (RAG) chatbot interface.</w:t>
+      </w:r>
+      <w:r>
+        <w:rPr>
+          <w:rStyle w:val="Emphasis"/>
+          <w:szCs w:val="26"/>
+        </w:rPr>
+        <w:t xml:space="preserve"> </w:t>
+      </w:r>
+      <w:r>
+        <w:rPr>
+          <w:rStyle w:val="Emphasis"/>
+          <w:szCs w:val="26"/>
+        </w:rPr>
         <w:t>The final system demonstrates how tacit troubleshooting knowledge can be codified into explicit SOPs, how document-level metadata can prevent unauthorized retrieval, and how a chatbot can provide fast answers while respecting governance guardrails. The main business value is improved findability, reduced repeated work, better support consistency, and a stronger foundation for organizational learning.</w:t>
       </w:r>
     </w:p>
     <w:p/>
     <w:p>
-      <w:pPr>
-        <w:pStyle w:val="Heading1"/>
-      </w:pPr>
       <w:r>
         <w:br w:type="page"/>
       </w:r>
@@ -1274,6 +1239,15 @@
     <w:bookmarkStart w:id="2" w:name="_Toc232606763" w:displacedByCustomXml="next"/>
     <w:sdt>
       <w:sdtPr>
+        <w:rPr>
+          <w:b w:val="0"/>
+          <w:noProof w:val="0"/>
+          <w:color w:val="auto"/>
+          <w:sz w:val="26"/>
+          <w:szCs w:val="24"/>
+          <w:bdr w:val="none" w:sz="0" w:space="0" w:color="auto"/>
+          <w:shd w:val="clear" w:color="auto" w:fill="auto"/>
+        </w:rPr>
         <w:id w:val="1110091376"/>
         <w:docPartObj>
           <w:docPartGallery w:val="Table of Contents"/>
@@ -1283,11 +1257,6 @@
       <w:sdtEndPr>
         <w:rPr>
           <w:bCs/>
-          <w:color w:val="auto"/>
-          <w:sz w:val="26"/>
-          <w:szCs w:val="24"/>
-          <w:bdr w:val="none" w:sz="0" w:space="0" w:color="auto"/>
-          <w:shd w:val="clear" w:color="auto" w:fill="auto"/>
         </w:rPr>
       </w:sdtEndPr>
       <w:sdtContent>
@@ -3418,15 +3387,15 @@
       </w:r>
       <w:bookmarkStart w:id="3" w:name="_Toc516582884"/>
       <w:bookmarkStart w:id="4" w:name="_Toc232083018"/>
-      <w:bookmarkStart w:id="5" w:name="_Toc251616691"/>
-      <w:bookmarkStart w:id="6" w:name="_Toc232606764"/>
+      <w:bookmarkStart w:id="5" w:name="_Toc232606764"/>
+      <w:bookmarkStart w:id="6" w:name="_Toc251616691"/>
       <w:r>
         <w:lastRenderedPageBreak/>
         <w:t>ACKNOWLEDGEMENTS</w:t>
       </w:r>
       <w:bookmarkEnd w:id="3"/>
       <w:bookmarkEnd w:id="4"/>
-      <w:bookmarkEnd w:id="6"/>
+      <w:bookmarkEnd w:id="5"/>
     </w:p>
     <w:p>
       <w:pPr>
@@ -3456,15 +3425,12 @@
       </w:r>
     </w:p>
     <w:p>
-      <w:pPr>
-        <w:pStyle w:val="Heading1"/>
-      </w:pPr>
       <w:r>
         <w:br w:type="page"/>
       </w:r>
       <w:bookmarkStart w:id="7" w:name="_Toc232083019"/>
       <w:bookmarkStart w:id="8" w:name="_Toc232606765"/>
-      <w:bookmarkEnd w:id="5"/>
+      <w:bookmarkEnd w:id="6"/>
       <w:r>
         <w:lastRenderedPageBreak/>
         <w:t>TABLE OF FIGURES</w:t>
@@ -3488,9 +3454,6 @@
       </w:r>
     </w:p>
     <w:p>
-      <w:pPr>
-        <w:pStyle w:val="Heading1"/>
-      </w:pPr>
       <w:r>
         <w:br w:type="page"/>
       </w:r>
@@ -4406,8 +4369,8 @@
         <w:pStyle w:val="Heading3"/>
       </w:pPr>
       <w:bookmarkStart w:id="23" w:name="_Toc232083027"/>
-      <w:bookmarkStart w:id="24" w:name="_Toc181178230"/>
-      <w:bookmarkStart w:id="25" w:name="_Toc232606773"/>
+      <w:bookmarkStart w:id="24" w:name="_Toc232606773"/>
+      <w:bookmarkStart w:id="25" w:name="_Toc181178230"/>
       <w:r>
         <w:t>Simulated</w:t>
       </w:r>
@@ -4421,7 +4384,7 @@
         <w:t>Company Profile</w:t>
       </w:r>
       <w:bookmarkEnd w:id="23"/>
-      <w:bookmarkEnd w:id="25"/>
+      <w:bookmarkEnd w:id="24"/>
     </w:p>
     <w:p>
       <w:pPr>
@@ -5235,14 +5198,14 @@
         <w:pStyle w:val="Heading2"/>
       </w:pPr>
       <w:bookmarkStart w:id="30" w:name="_Toc232083030"/>
-      <w:bookmarkStart w:id="31" w:name="_Toc235227523"/>
-      <w:bookmarkStart w:id="32" w:name="_Toc232606776"/>
+      <w:bookmarkStart w:id="31" w:name="_Toc232606776"/>
+      <w:bookmarkStart w:id="32" w:name="_Toc235227523"/>
       <w:r>
         <w:lastRenderedPageBreak/>
         <w:t>KNOWLEDGE ARCHITECTURE &amp; EXPERIENTIAL CAPTURE</w:t>
       </w:r>
       <w:bookmarkEnd w:id="30"/>
-      <w:bookmarkEnd w:id="32"/>
+      <w:bookmarkEnd w:id="31"/>
     </w:p>
     <w:p>
       <w:pPr>
@@ -6382,7 +6345,6 @@
               <w:jc w:val="left"/>
             </w:pPr>
             <w:r>
-              <w:lastRenderedPageBreak/>
               <w:t>Hybrid model</w:t>
             </w:r>
           </w:p>
@@ -6550,7 +6512,7 @@
       </w:pPr>
       <w:bookmarkStart w:id="66" w:name="_Toc232083047"/>
       <w:bookmarkStart w:id="67" w:name="_Toc232606793"/>
-      <w:bookmarkEnd w:id="31"/>
+      <w:bookmarkEnd w:id="32"/>
       <w:bookmarkEnd w:id="65"/>
       <w:r>
         <w:lastRenderedPageBreak/>
@@ -6756,7 +6718,7 @@
         <w:lastRenderedPageBreak/>
         <w:t>APPENDICES</w:t>
       </w:r>
-      <w:bookmarkEnd w:id="24"/>
+      <w:bookmarkEnd w:id="25"/>
       <w:bookmarkEnd w:id="68"/>
       <w:bookmarkEnd w:id="69"/>
     </w:p>

</xml_diff>